<commit_message>
update rule of life template
</commit_message>
<xml_diff>
--- a/downloads/interMission_Rule_of_life_template.docx
+++ b/downloads/interMission_Rule_of_life_template.docx
@@ -4,460 +4,905 @@
   <w:body>
     <w:p>
       <w:pPr>
-        <w:pStyle w:val="Heading1"/>
+        <w:spacing w:after="60"/>
+        <w:jc w:val="center"/>
       </w:pPr>
       <w:r>
+        <w:rPr>
+          <w:b/>
+          <w:bCs/>
+          <w:color w:val="1E3A5F"/>
+          <w:sz w:val="36"/>
+          <w:szCs w:val="36"/>
+        </w:rPr>
         <w:t>interMission Rule of Life</w:t>
+      </w:r>
+    </w:p>
+    <w:p>
+      <w:pPr>
+        <w:spacing w:after="80"/>
+        <w:jc w:val="center"/>
+      </w:pPr>
+      <w:r>
+        <w:rPr>
+          <w:color w:val="AAAAAA"/>
+        </w:rPr>
+        <w:t>MONTH</w:t>
+      </w:r>
+      <w:r>
+        <w:rPr>
+          <w:color w:val="AAAAAA"/>
+        </w:rPr>
+        <w:t xml:space="preserve"> 20</w:t>
+      </w:r>
+      <w:r>
+        <w:rPr>
+          <w:color w:val="AAAAAA"/>
+        </w:rPr>
+        <w:t>##</w:t>
+      </w:r>
+      <w:r>
+        <w:rPr>
+          <w:color w:val="AAAAAA"/>
+        </w:rPr>
+        <w:t xml:space="preserve"> </w:t>
+      </w:r>
+      <w:r>
+        <w:rPr>
+          <w:color w:val="AAAAAA"/>
+        </w:rPr>
+        <w:t>–</w:t>
+      </w:r>
+      <w:r>
+        <w:rPr>
+          <w:color w:val="AAAAAA"/>
+        </w:rPr>
+        <w:t xml:space="preserve"> </w:t>
+      </w:r>
+      <w:r>
+        <w:rPr>
+          <w:color w:val="AAAAAA"/>
+        </w:rPr>
+        <w:t>December 31, 20</w:t>
+      </w:r>
+      <w:r>
+        <w:rPr>
+          <w:color w:val="AAAAAA"/>
+        </w:rPr>
+        <w:t>##</w:t>
+      </w:r>
+    </w:p>
+    <w:p>
+      <w:pPr>
+        <w:pBdr>
+          <w:bottom w:val="single" w:sz="4" w:space="6" w:color="B8952A"/>
+        </w:pBdr>
+        <w:spacing w:after="180"/>
+        <w:jc w:val="center"/>
+        <w:rPr>
+          <w:i/>
+          <w:iCs/>
+          <w:color w:val="444444"/>
+          <w:sz w:val="18"/>
+          <w:szCs w:val="18"/>
+        </w:rPr>
+      </w:pPr>
+      <w:r>
+        <w:rPr>
+          <w:i/>
+          <w:iCs/>
+          <w:color w:val="444444"/>
+          <w:sz w:val="18"/>
+          <w:szCs w:val="18"/>
+        </w:rPr>
+        <w:t xml:space="preserve">Optional scripture verse or </w:t>
+      </w:r>
+      <w:r>
+        <w:rPr>
+          <w:i/>
+          <w:iCs/>
+          <w:color w:val="444444"/>
+          <w:sz w:val="18"/>
+          <w:szCs w:val="18"/>
+        </w:rPr>
+        <w:t xml:space="preserve">intention statement, etc. </w:t>
       </w:r>
     </w:p>
     <w:tbl>
       <w:tblPr>
-        <w:tblStyle w:val="TableGrid"/>
-        <w:tblW w:w="0" w:type="auto"/>
-        <w:tblLayout w:type="fixed"/>
+        <w:tblW w:w="10512" w:type="dxa"/>
+        <w:tblBorders>
+          <w:top w:val="single" w:sz="4" w:space="0" w:color="auto"/>
+          <w:left w:val="single" w:sz="4" w:space="0" w:color="auto"/>
+          <w:bottom w:val="single" w:sz="4" w:space="0" w:color="auto"/>
+          <w:right w:val="single" w:sz="4" w:space="0" w:color="auto"/>
+          <w:insideH w:val="single" w:sz="4" w:space="0" w:color="auto"/>
+          <w:insideV w:val="single" w:sz="4" w:space="0" w:color="auto"/>
+        </w:tblBorders>
+        <w:tblCellMar>
+          <w:left w:w="10" w:type="dxa"/>
+          <w:right w:w="10" w:type="dxa"/>
+        </w:tblCellMar>
         <w:tblLook w:val="04A0" w:firstRow="1" w:lastRow="0" w:firstColumn="1" w:lastColumn="0" w:noHBand="0" w:noVBand="1"/>
       </w:tblPr>
       <w:tblGrid>
-        <w:gridCol w:w="2158"/>
-        <w:gridCol w:w="2448"/>
-        <w:gridCol w:w="2448"/>
-        <w:gridCol w:w="2448"/>
-        <w:gridCol w:w="2448"/>
-        <w:gridCol w:w="2448"/>
+        <w:gridCol w:w="1415"/>
+        <w:gridCol w:w="2044"/>
+        <w:gridCol w:w="2036"/>
+        <w:gridCol w:w="1758"/>
+        <w:gridCol w:w="1630"/>
+        <w:gridCol w:w="1629"/>
       </w:tblGrid>
       <w:tr>
-        <w:tc>
-          <w:tcPr>
-            <w:tcW w:w="2158" w:type="dxa"/>
-            <w:tcBorders>
-              <w:top w:val="nil"/>
-              <w:left w:val="nil"/>
-              <w:bottom w:val="nil"/>
-              <w:right w:val="nil"/>
-            </w:tcBorders>
-          </w:tcPr>
-          <w:p/>
-        </w:tc>
-        <w:tc>
-          <w:tcPr>
-            <w:tcW w:w="2448" w:type="dxa"/>
-            <w:tcBorders>
-              <w:top w:val="nil"/>
-              <w:left w:val="nil"/>
-              <w:bottom w:val="single" w:sz="4" w:space="0" w:color="auto"/>
-              <w:right w:val="nil"/>
-            </w:tcBorders>
+        <w:trPr>
+          <w:tblHeader/>
+        </w:trPr>
+        <w:tc>
+          <w:tcPr>
+            <w:tcW w:w="1415" w:type="dxa"/>
+            <w:tcBorders>
+              <w:top w:val="single" w:sz="1" w:space="0" w:color="C8D8E8"/>
+              <w:left w:val="single" w:sz="1" w:space="0" w:color="C8D8E8"/>
+              <w:bottom w:val="single" w:sz="1" w:space="0" w:color="C8D8E8"/>
+              <w:right w:val="single" w:sz="1" w:space="0" w:color="C8D8E8"/>
+            </w:tcBorders>
+            <w:shd w:val="clear" w:color="auto" w:fill="1E3A5F"/>
+            <w:tcMar>
+              <w:top w:w="80" w:type="dxa"/>
+              <w:left w:w="120" w:type="dxa"/>
+              <w:bottom w:w="80" w:type="dxa"/>
+              <w:right w:w="120" w:type="dxa"/>
+            </w:tcMar>
+            <w:vAlign w:val="center"/>
+          </w:tcPr>
+          <w:p>
+            <w:pPr>
+              <w:jc w:val="center"/>
+            </w:pPr>
+          </w:p>
+        </w:tc>
+        <w:tc>
+          <w:tcPr>
+            <w:tcW w:w="2044" w:type="dxa"/>
+            <w:tcBorders>
+              <w:top w:val="single" w:sz="1" w:space="0" w:color="C8D8E8"/>
+              <w:left w:val="single" w:sz="1" w:space="0" w:color="C8D8E8"/>
+              <w:bottom w:val="single" w:sz="1" w:space="0" w:color="C8D8E8"/>
+              <w:right w:val="single" w:sz="1" w:space="0" w:color="C8D8E8"/>
+            </w:tcBorders>
+            <w:shd w:val="clear" w:color="auto" w:fill="1E3A5F"/>
+            <w:tcMar>
+              <w:top w:w="80" w:type="dxa"/>
+              <w:left w:w="120" w:type="dxa"/>
+              <w:bottom w:w="80" w:type="dxa"/>
+              <w:right w:w="120" w:type="dxa"/>
+            </w:tcMar>
+            <w:vAlign w:val="center"/>
+          </w:tcPr>
+          <w:p>
+            <w:pPr>
+              <w:jc w:val="center"/>
+            </w:pPr>
+            <w:r>
+              <w:rPr>
+                <w:b/>
+                <w:bCs/>
+                <w:color w:val="FFFFFF"/>
+                <w:sz w:val="18"/>
+                <w:szCs w:val="18"/>
+              </w:rPr>
+              <w:t>DAILY</w:t>
+            </w:r>
+          </w:p>
+        </w:tc>
+        <w:tc>
+          <w:tcPr>
+            <w:tcW w:w="2036" w:type="dxa"/>
+            <w:tcBorders>
+              <w:top w:val="single" w:sz="1" w:space="0" w:color="C8D8E8"/>
+              <w:left w:val="single" w:sz="1" w:space="0" w:color="C8D8E8"/>
+              <w:bottom w:val="single" w:sz="1" w:space="0" w:color="C8D8E8"/>
+              <w:right w:val="single" w:sz="1" w:space="0" w:color="C8D8E8"/>
+            </w:tcBorders>
+            <w:shd w:val="clear" w:color="auto" w:fill="1E3A5F"/>
+            <w:tcMar>
+              <w:top w:w="80" w:type="dxa"/>
+              <w:left w:w="120" w:type="dxa"/>
+              <w:bottom w:w="80" w:type="dxa"/>
+              <w:right w:w="120" w:type="dxa"/>
+            </w:tcMar>
+            <w:vAlign w:val="center"/>
+          </w:tcPr>
+          <w:p>
+            <w:pPr>
+              <w:jc w:val="center"/>
+            </w:pPr>
+            <w:r>
+              <w:rPr>
+                <w:b/>
+                <w:bCs/>
+                <w:color w:val="FFFFFF"/>
+                <w:sz w:val="18"/>
+                <w:szCs w:val="18"/>
+              </w:rPr>
+              <w:t>WEEKLY</w:t>
+            </w:r>
+          </w:p>
+        </w:tc>
+        <w:tc>
+          <w:tcPr>
+            <w:tcW w:w="1758" w:type="dxa"/>
+            <w:tcBorders>
+              <w:top w:val="single" w:sz="1" w:space="0" w:color="C8D8E8"/>
+              <w:left w:val="single" w:sz="1" w:space="0" w:color="C8D8E8"/>
+              <w:bottom w:val="single" w:sz="1" w:space="0" w:color="C8D8E8"/>
+              <w:right w:val="single" w:sz="1" w:space="0" w:color="C8D8E8"/>
+            </w:tcBorders>
+            <w:shd w:val="clear" w:color="auto" w:fill="1E3A5F"/>
+            <w:tcMar>
+              <w:top w:w="80" w:type="dxa"/>
+              <w:left w:w="120" w:type="dxa"/>
+              <w:bottom w:w="80" w:type="dxa"/>
+              <w:right w:w="120" w:type="dxa"/>
+            </w:tcMar>
+            <w:vAlign w:val="center"/>
+          </w:tcPr>
+          <w:p>
+            <w:pPr>
+              <w:jc w:val="center"/>
+            </w:pPr>
+            <w:r>
+              <w:rPr>
+                <w:b/>
+                <w:bCs/>
+                <w:color w:val="FFFFFF"/>
+                <w:sz w:val="18"/>
+                <w:szCs w:val="18"/>
+              </w:rPr>
+              <w:t>MONTHLY</w:t>
+            </w:r>
+          </w:p>
+        </w:tc>
+        <w:tc>
+          <w:tcPr>
+            <w:tcW w:w="1630" w:type="dxa"/>
+            <w:tcBorders>
+              <w:top w:val="single" w:sz="1" w:space="0" w:color="C8D8E8"/>
+              <w:left w:val="single" w:sz="1" w:space="0" w:color="C8D8E8"/>
+              <w:bottom w:val="single" w:sz="1" w:space="0" w:color="C8D8E8"/>
+              <w:right w:val="single" w:sz="1" w:space="0" w:color="C8D8E8"/>
+            </w:tcBorders>
+            <w:shd w:val="clear" w:color="auto" w:fill="1E3A5F"/>
+            <w:tcMar>
+              <w:top w:w="80" w:type="dxa"/>
+              <w:left w:w="120" w:type="dxa"/>
+              <w:bottom w:w="80" w:type="dxa"/>
+              <w:right w:w="120" w:type="dxa"/>
+            </w:tcMar>
+            <w:vAlign w:val="center"/>
+          </w:tcPr>
+          <w:p>
+            <w:pPr>
+              <w:jc w:val="center"/>
+            </w:pPr>
+            <w:r>
+              <w:rPr>
+                <w:b/>
+                <w:bCs/>
+                <w:color w:val="FFFFFF"/>
+                <w:sz w:val="18"/>
+                <w:szCs w:val="18"/>
+              </w:rPr>
+              <w:t>SEASONAL</w:t>
+            </w:r>
+          </w:p>
+        </w:tc>
+        <w:tc>
+          <w:tcPr>
+            <w:tcW w:w="1629" w:type="dxa"/>
+            <w:tcBorders>
+              <w:top w:val="single" w:sz="1" w:space="0" w:color="C8D8E8"/>
+              <w:left w:val="single" w:sz="1" w:space="0" w:color="C8D8E8"/>
+              <w:bottom w:val="single" w:sz="1" w:space="0" w:color="C8D8E8"/>
+              <w:right w:val="single" w:sz="1" w:space="0" w:color="C8D8E8"/>
+            </w:tcBorders>
+            <w:shd w:val="clear" w:color="auto" w:fill="1E3A5F"/>
+            <w:tcMar>
+              <w:top w:w="80" w:type="dxa"/>
+              <w:left w:w="120" w:type="dxa"/>
+              <w:bottom w:w="80" w:type="dxa"/>
+              <w:right w:w="120" w:type="dxa"/>
+            </w:tcMar>
+            <w:vAlign w:val="center"/>
+          </w:tcPr>
+          <w:p>
+            <w:pPr>
+              <w:jc w:val="center"/>
+            </w:pPr>
+            <w:r>
+              <w:rPr>
+                <w:b/>
+                <w:bCs/>
+                <w:color w:val="FFFFFF"/>
+                <w:sz w:val="18"/>
+                <w:szCs w:val="18"/>
+              </w:rPr>
+              <w:t>ANNUALLY</w:t>
+            </w:r>
+          </w:p>
+        </w:tc>
+      </w:tr>
+      <w:tr>
+        <w:tc>
+          <w:tcPr>
+            <w:tcW w:w="1415" w:type="dxa"/>
+            <w:tcBorders>
+              <w:top w:val="single" w:sz="1" w:space="0" w:color="C8D8E8"/>
+              <w:left w:val="single" w:sz="1" w:space="0" w:color="C8D8E8"/>
+              <w:bottom w:val="single" w:sz="1" w:space="0" w:color="C8D8E8"/>
+              <w:right w:val="single" w:sz="1" w:space="0" w:color="C8D8E8"/>
+            </w:tcBorders>
+            <w:shd w:val="clear" w:color="auto" w:fill="2E5FA3"/>
+            <w:tcMar>
+              <w:top w:w="80" w:type="dxa"/>
+              <w:left w:w="120" w:type="dxa"/>
+              <w:bottom w:w="80" w:type="dxa"/>
+              <w:right w:w="120" w:type="dxa"/>
+            </w:tcMar>
+            <w:vAlign w:val="center"/>
+          </w:tcPr>
+          <w:p>
+            <w:pPr>
+              <w:jc w:val="center"/>
+            </w:pPr>
+            <w:r>
+              <w:rPr>
+                <w:b/>
+                <w:bCs/>
+                <w:color w:val="FFFFFF"/>
+                <w:sz w:val="16"/>
+                <w:szCs w:val="16"/>
+              </w:rPr>
+              <w:t>FOUNDATIONS</w:t>
+            </w:r>
+          </w:p>
+        </w:tc>
+        <w:tc>
+          <w:tcPr>
+            <w:tcW w:w="2044" w:type="dxa"/>
+            <w:tcBorders>
+              <w:top w:val="single" w:sz="1" w:space="0" w:color="C8D8E8"/>
+              <w:left w:val="single" w:sz="1" w:space="0" w:color="C8D8E8"/>
+              <w:bottom w:val="single" w:sz="1" w:space="0" w:color="C8D8E8"/>
+              <w:right w:val="single" w:sz="1" w:space="0" w:color="C8D8E8"/>
+            </w:tcBorders>
+            <w:shd w:val="clear" w:color="auto" w:fill="EEF4FA"/>
+            <w:tcMar>
+              <w:top w:w="80" w:type="dxa"/>
+              <w:left w:w="120" w:type="dxa"/>
+              <w:bottom w:w="80" w:type="dxa"/>
+              <w:right w:w="120" w:type="dxa"/>
+            </w:tcMar>
+          </w:tcPr>
+          <w:p/>
+          <w:p/>
+          <w:p/>
+          <w:p/>
+          <w:p/>
+          <w:p/>
+          <w:p/>
+          <w:p/>
+          <w:p/>
+          <w:p/>
+          <w:p/>
+          <w:p/>
+        </w:tc>
+        <w:tc>
+          <w:tcPr>
+            <w:tcW w:w="2036" w:type="dxa"/>
+            <w:tcBorders>
+              <w:top w:val="single" w:sz="1" w:space="0" w:color="C8D8E8"/>
+              <w:left w:val="single" w:sz="1" w:space="0" w:color="C8D8E8"/>
+              <w:bottom w:val="single" w:sz="1" w:space="0" w:color="C8D8E8"/>
+              <w:right w:val="single" w:sz="1" w:space="0" w:color="C8D8E8"/>
+            </w:tcBorders>
+            <w:shd w:val="clear" w:color="auto" w:fill="EEF4FA"/>
+            <w:tcMar>
+              <w:top w:w="80" w:type="dxa"/>
+              <w:left w:w="120" w:type="dxa"/>
+              <w:bottom w:w="80" w:type="dxa"/>
+              <w:right w:w="120" w:type="dxa"/>
+            </w:tcMar>
+          </w:tcPr>
+          <w:p/>
+        </w:tc>
+        <w:tc>
+          <w:tcPr>
+            <w:tcW w:w="1758" w:type="dxa"/>
+            <w:tcBorders>
+              <w:top w:val="single" w:sz="1" w:space="0" w:color="C8D8E8"/>
+              <w:left w:val="single" w:sz="1" w:space="0" w:color="C8D8E8"/>
+              <w:bottom w:val="single" w:sz="1" w:space="0" w:color="C8D8E8"/>
+              <w:right w:val="single" w:sz="1" w:space="0" w:color="C8D8E8"/>
+            </w:tcBorders>
+            <w:shd w:val="clear" w:color="auto" w:fill="EEF4FA"/>
+            <w:tcMar>
+              <w:top w:w="80" w:type="dxa"/>
+              <w:left w:w="120" w:type="dxa"/>
+              <w:bottom w:w="80" w:type="dxa"/>
+              <w:right w:w="120" w:type="dxa"/>
+            </w:tcMar>
+          </w:tcPr>
+          <w:p/>
+        </w:tc>
+        <w:tc>
+          <w:tcPr>
+            <w:tcW w:w="1630" w:type="dxa"/>
+            <w:tcBorders>
+              <w:top w:val="single" w:sz="1" w:space="0" w:color="C8D8E8"/>
+              <w:left w:val="single" w:sz="1" w:space="0" w:color="C8D8E8"/>
+              <w:bottom w:val="single" w:sz="1" w:space="0" w:color="C8D8E8"/>
+              <w:right w:val="single" w:sz="1" w:space="0" w:color="C8D8E8"/>
+            </w:tcBorders>
+            <w:shd w:val="clear" w:color="auto" w:fill="EEF4FA"/>
+            <w:tcMar>
+              <w:top w:w="80" w:type="dxa"/>
+              <w:left w:w="120" w:type="dxa"/>
+              <w:bottom w:w="80" w:type="dxa"/>
+              <w:right w:w="120" w:type="dxa"/>
+            </w:tcMar>
+          </w:tcPr>
+          <w:p/>
+        </w:tc>
+        <w:tc>
+          <w:tcPr>
+            <w:tcW w:w="1629" w:type="dxa"/>
+            <w:tcBorders>
+              <w:top w:val="single" w:sz="1" w:space="0" w:color="C8D8E8"/>
+              <w:left w:val="single" w:sz="1" w:space="0" w:color="C8D8E8"/>
+              <w:bottom w:val="single" w:sz="1" w:space="0" w:color="C8D8E8"/>
+              <w:right w:val="single" w:sz="1" w:space="0" w:color="C8D8E8"/>
+            </w:tcBorders>
+            <w:shd w:val="clear" w:color="auto" w:fill="EEF4FA"/>
+            <w:tcMar>
+              <w:top w:w="80" w:type="dxa"/>
+              <w:left w:w="120" w:type="dxa"/>
+              <w:bottom w:w="80" w:type="dxa"/>
+              <w:right w:w="120" w:type="dxa"/>
+            </w:tcMar>
+          </w:tcPr>
+          <w:p/>
+        </w:tc>
+      </w:tr>
+      <w:tr>
+        <w:tc>
+          <w:tcPr>
+            <w:tcW w:w="1415" w:type="dxa"/>
+            <w:tcBorders>
+              <w:top w:val="single" w:sz="1" w:space="0" w:color="C8D8E8"/>
+              <w:left w:val="single" w:sz="1" w:space="0" w:color="C8D8E8"/>
+              <w:bottom w:val="single" w:sz="1" w:space="0" w:color="C8D8E8"/>
+              <w:right w:val="single" w:sz="1" w:space="0" w:color="C8D8E8"/>
+            </w:tcBorders>
+            <w:shd w:val="clear" w:color="auto" w:fill="2E5FA3"/>
+            <w:tcMar>
+              <w:top w:w="80" w:type="dxa"/>
+              <w:left w:w="120" w:type="dxa"/>
+              <w:bottom w:w="80" w:type="dxa"/>
+              <w:right w:w="120" w:type="dxa"/>
+            </w:tcMar>
+            <w:vAlign w:val="center"/>
+          </w:tcPr>
+          <w:p>
+            <w:pPr>
+              <w:jc w:val="center"/>
+            </w:pPr>
+            <w:r>
+              <w:rPr>
+                <w:b/>
+                <w:bCs/>
+                <w:color w:val="FFFFFF"/>
+                <w:sz w:val="16"/>
+                <w:szCs w:val="16"/>
+              </w:rPr>
+              <w:t>PRAYER</w:t>
+            </w:r>
+          </w:p>
+        </w:tc>
+        <w:tc>
+          <w:tcPr>
+            <w:tcW w:w="2044" w:type="dxa"/>
+            <w:tcBorders>
+              <w:top w:val="single" w:sz="1" w:space="0" w:color="C8D8E8"/>
+              <w:left w:val="single" w:sz="1" w:space="0" w:color="C8D8E8"/>
+              <w:bottom w:val="single" w:sz="1" w:space="0" w:color="C8D8E8"/>
+              <w:right w:val="single" w:sz="1" w:space="0" w:color="C8D8E8"/>
+            </w:tcBorders>
+            <w:shd w:val="clear" w:color="auto" w:fill="FFFFFF"/>
+            <w:tcMar>
+              <w:top w:w="80" w:type="dxa"/>
+              <w:left w:w="120" w:type="dxa"/>
+              <w:bottom w:w="80" w:type="dxa"/>
+              <w:right w:w="120" w:type="dxa"/>
+            </w:tcMar>
+          </w:tcPr>
+          <w:p/>
+          <w:p/>
+          <w:p/>
+          <w:p/>
+          <w:p/>
+          <w:p/>
+          <w:p/>
+          <w:p/>
+          <w:p/>
+          <w:p/>
+          <w:p/>
+          <w:p/>
+        </w:tc>
+        <w:tc>
+          <w:tcPr>
+            <w:tcW w:w="2036" w:type="dxa"/>
+            <w:tcBorders>
+              <w:top w:val="single" w:sz="1" w:space="0" w:color="C8D8E8"/>
+              <w:left w:val="single" w:sz="1" w:space="0" w:color="C8D8E8"/>
+              <w:bottom w:val="single" w:sz="1" w:space="0" w:color="C8D8E8"/>
+              <w:right w:val="single" w:sz="1" w:space="0" w:color="C8D8E8"/>
+            </w:tcBorders>
+            <w:shd w:val="clear" w:color="auto" w:fill="FFFFFF"/>
+            <w:tcMar>
+              <w:top w:w="80" w:type="dxa"/>
+              <w:left w:w="120" w:type="dxa"/>
+              <w:bottom w:w="80" w:type="dxa"/>
+              <w:right w:w="120" w:type="dxa"/>
+            </w:tcMar>
+          </w:tcPr>
+          <w:p/>
+        </w:tc>
+        <w:tc>
+          <w:tcPr>
+            <w:tcW w:w="1758" w:type="dxa"/>
+            <w:tcBorders>
+              <w:top w:val="single" w:sz="1" w:space="0" w:color="C8D8E8"/>
+              <w:left w:val="single" w:sz="1" w:space="0" w:color="C8D8E8"/>
+              <w:bottom w:val="single" w:sz="1" w:space="0" w:color="C8D8E8"/>
+              <w:right w:val="single" w:sz="1" w:space="0" w:color="C8D8E8"/>
+            </w:tcBorders>
+            <w:shd w:val="clear" w:color="auto" w:fill="FFFFFF"/>
+            <w:tcMar>
+              <w:top w:w="80" w:type="dxa"/>
+              <w:left w:w="120" w:type="dxa"/>
+              <w:bottom w:w="80" w:type="dxa"/>
+              <w:right w:w="120" w:type="dxa"/>
+            </w:tcMar>
+          </w:tcPr>
+          <w:p/>
+        </w:tc>
+        <w:tc>
+          <w:tcPr>
+            <w:tcW w:w="1630" w:type="dxa"/>
+            <w:tcBorders>
+              <w:top w:val="single" w:sz="1" w:space="0" w:color="C8D8E8"/>
+              <w:left w:val="single" w:sz="1" w:space="0" w:color="C8D8E8"/>
+              <w:bottom w:val="single" w:sz="1" w:space="0" w:color="C8D8E8"/>
+              <w:right w:val="single" w:sz="1" w:space="0" w:color="C8D8E8"/>
+            </w:tcBorders>
+            <w:shd w:val="clear" w:color="auto" w:fill="FFFFFF"/>
+            <w:tcMar>
+              <w:top w:w="80" w:type="dxa"/>
+              <w:left w:w="120" w:type="dxa"/>
+              <w:bottom w:w="80" w:type="dxa"/>
+              <w:right w:w="120" w:type="dxa"/>
+            </w:tcMar>
+          </w:tcPr>
+          <w:p/>
+        </w:tc>
+        <w:tc>
+          <w:tcPr>
+            <w:tcW w:w="1629" w:type="dxa"/>
+            <w:tcBorders>
+              <w:top w:val="single" w:sz="1" w:space="0" w:color="C8D8E8"/>
+              <w:left w:val="single" w:sz="1" w:space="0" w:color="C8D8E8"/>
+              <w:bottom w:val="single" w:sz="1" w:space="0" w:color="C8D8E8"/>
+              <w:right w:val="single" w:sz="1" w:space="0" w:color="C8D8E8"/>
+            </w:tcBorders>
+            <w:shd w:val="clear" w:color="auto" w:fill="FFFFFF"/>
+            <w:tcMar>
+              <w:top w:w="80" w:type="dxa"/>
+              <w:left w:w="120" w:type="dxa"/>
+              <w:bottom w:w="80" w:type="dxa"/>
+              <w:right w:w="120" w:type="dxa"/>
+            </w:tcMar>
+          </w:tcPr>
+          <w:p/>
+        </w:tc>
+      </w:tr>
+      <w:tr>
+        <w:tc>
+          <w:tcPr>
+            <w:tcW w:w="1415" w:type="dxa"/>
+            <w:tcBorders>
+              <w:top w:val="single" w:sz="1" w:space="0" w:color="C8D8E8"/>
+              <w:left w:val="single" w:sz="1" w:space="0" w:color="C8D8E8"/>
+              <w:bottom w:val="single" w:sz="1" w:space="0" w:color="C8D8E8"/>
+              <w:right w:val="single" w:sz="1" w:space="0" w:color="C8D8E8"/>
+            </w:tcBorders>
+            <w:shd w:val="clear" w:color="auto" w:fill="2E5FA3"/>
+            <w:tcMar>
+              <w:top w:w="80" w:type="dxa"/>
+              <w:left w:w="120" w:type="dxa"/>
+              <w:bottom w:w="80" w:type="dxa"/>
+              <w:right w:w="120" w:type="dxa"/>
+            </w:tcMar>
+            <w:vAlign w:val="center"/>
+          </w:tcPr>
+          <w:p>
+            <w:pPr>
+              <w:jc w:val="center"/>
+            </w:pPr>
+            <w:r>
+              <w:rPr>
+                <w:b/>
+                <w:bCs/>
+                <w:color w:val="FFFFFF"/>
+                <w:sz w:val="16"/>
+                <w:szCs w:val="16"/>
+              </w:rPr>
+              <w:t>RHYTHMS</w:t>
+            </w:r>
+          </w:p>
+        </w:tc>
+        <w:tc>
+          <w:tcPr>
+            <w:tcW w:w="2044" w:type="dxa"/>
+            <w:tcBorders>
+              <w:top w:val="single" w:sz="1" w:space="0" w:color="C8D8E8"/>
+              <w:left w:val="single" w:sz="1" w:space="0" w:color="C8D8E8"/>
+              <w:bottom w:val="single" w:sz="1" w:space="0" w:color="C8D8E8"/>
+              <w:right w:val="single" w:sz="1" w:space="0" w:color="C8D8E8"/>
+            </w:tcBorders>
+            <w:shd w:val="clear" w:color="auto" w:fill="EEF4FA"/>
+            <w:tcMar>
+              <w:top w:w="80" w:type="dxa"/>
+              <w:left w:w="120" w:type="dxa"/>
+              <w:bottom w:w="80" w:type="dxa"/>
+              <w:right w:w="120" w:type="dxa"/>
+            </w:tcMar>
+          </w:tcPr>
+          <w:p/>
+          <w:p/>
+          <w:p/>
+          <w:p/>
+          <w:p/>
+          <w:p/>
+          <w:p/>
+          <w:p/>
+          <w:p/>
+          <w:p/>
+          <w:p/>
+          <w:p/>
+        </w:tc>
+        <w:tc>
+          <w:tcPr>
+            <w:tcW w:w="2036" w:type="dxa"/>
+            <w:tcBorders>
+              <w:top w:val="single" w:sz="1" w:space="0" w:color="C8D8E8"/>
+              <w:left w:val="single" w:sz="1" w:space="0" w:color="C8D8E8"/>
+              <w:bottom w:val="single" w:sz="1" w:space="0" w:color="C8D8E8"/>
+              <w:right w:val="single" w:sz="1" w:space="0" w:color="C8D8E8"/>
+            </w:tcBorders>
+            <w:shd w:val="clear" w:color="auto" w:fill="EEF4FA"/>
+            <w:tcMar>
+              <w:top w:w="80" w:type="dxa"/>
+              <w:left w:w="120" w:type="dxa"/>
+              <w:bottom w:w="80" w:type="dxa"/>
+              <w:right w:w="120" w:type="dxa"/>
+            </w:tcMar>
+          </w:tcPr>
+          <w:p/>
+        </w:tc>
+        <w:tc>
+          <w:tcPr>
+            <w:tcW w:w="1758" w:type="dxa"/>
+            <w:tcBorders>
+              <w:top w:val="single" w:sz="1" w:space="0" w:color="C8D8E8"/>
+              <w:left w:val="single" w:sz="1" w:space="0" w:color="C8D8E8"/>
+              <w:bottom w:val="single" w:sz="1" w:space="0" w:color="C8D8E8"/>
+              <w:right w:val="single" w:sz="1" w:space="0" w:color="C8D8E8"/>
+            </w:tcBorders>
+            <w:shd w:val="clear" w:color="auto" w:fill="EEF4FA"/>
+            <w:tcMar>
+              <w:top w:w="80" w:type="dxa"/>
+              <w:left w:w="120" w:type="dxa"/>
+              <w:bottom w:w="80" w:type="dxa"/>
+              <w:right w:w="120" w:type="dxa"/>
+            </w:tcMar>
+          </w:tcPr>
+          <w:p/>
+        </w:tc>
+        <w:tc>
+          <w:tcPr>
+            <w:tcW w:w="1630" w:type="dxa"/>
+            <w:tcBorders>
+              <w:top w:val="single" w:sz="1" w:space="0" w:color="C8D8E8"/>
+              <w:left w:val="single" w:sz="1" w:space="0" w:color="C8D8E8"/>
+              <w:bottom w:val="single" w:sz="1" w:space="0" w:color="C8D8E8"/>
+              <w:right w:val="single" w:sz="1" w:space="0" w:color="C8D8E8"/>
+            </w:tcBorders>
+            <w:shd w:val="clear" w:color="auto" w:fill="EEF4FA"/>
+            <w:tcMar>
+              <w:top w:w="80" w:type="dxa"/>
+              <w:left w:w="120" w:type="dxa"/>
+              <w:bottom w:w="80" w:type="dxa"/>
+              <w:right w:w="120" w:type="dxa"/>
+            </w:tcMar>
+          </w:tcPr>
+          <w:p/>
+        </w:tc>
+        <w:tc>
+          <w:tcPr>
+            <w:tcW w:w="1629" w:type="dxa"/>
+            <w:tcBorders>
+              <w:top w:val="single" w:sz="1" w:space="0" w:color="C8D8E8"/>
+              <w:left w:val="single" w:sz="1" w:space="0" w:color="C8D8E8"/>
+              <w:bottom w:val="single" w:sz="1" w:space="0" w:color="C8D8E8"/>
+              <w:right w:val="single" w:sz="1" w:space="0" w:color="C8D8E8"/>
+            </w:tcBorders>
+            <w:shd w:val="clear" w:color="auto" w:fill="EEF4FA"/>
+            <w:tcMar>
+              <w:top w:w="80" w:type="dxa"/>
+              <w:left w:w="120" w:type="dxa"/>
+              <w:bottom w:w="80" w:type="dxa"/>
+              <w:right w:w="120" w:type="dxa"/>
+            </w:tcMar>
+          </w:tcPr>
+          <w:p/>
+        </w:tc>
+      </w:tr>
+      <w:tr>
+        <w:tc>
+          <w:tcPr>
+            <w:tcW w:w="1415" w:type="dxa"/>
+            <w:tcBorders>
+              <w:top w:val="single" w:sz="1" w:space="0" w:color="C8D8E8"/>
+              <w:left w:val="single" w:sz="1" w:space="0" w:color="C8D8E8"/>
+              <w:bottom w:val="single" w:sz="1" w:space="0" w:color="C8D8E8"/>
+              <w:right w:val="single" w:sz="1" w:space="0" w:color="C8D8E8"/>
+            </w:tcBorders>
+            <w:shd w:val="clear" w:color="auto" w:fill="2E5FA3"/>
+            <w:tcMar>
+              <w:top w:w="80" w:type="dxa"/>
+              <w:left w:w="120" w:type="dxa"/>
+              <w:bottom w:w="80" w:type="dxa"/>
+              <w:right w:w="120" w:type="dxa"/>
+            </w:tcMar>
+            <w:vAlign w:val="center"/>
           </w:tcPr>
           <w:p>
             <w:pPr>
               <w:jc w:val="center"/>
               <w:rPr>
-                <w:b/>
-                <w:bCs/>
+                <w:i/>
+                <w:iCs/>
               </w:rPr>
             </w:pPr>
             <w:r>
               <w:rPr>
                 <w:b/>
                 <w:bCs/>
+                <w:i/>
+                <w:iCs/>
+                <w:color w:val="FFFFFF"/>
+                <w:sz w:val="16"/>
+                <w:szCs w:val="16"/>
               </w:rPr>
-              <w:t>Daily</w:t>
+              <w:t>MISSIO DEI</w:t>
             </w:r>
           </w:p>
         </w:tc>
         <w:tc>
           <w:tcPr>
-            <w:tcW w:w="2448" w:type="dxa"/>
-            <w:tcBorders>
-              <w:top w:val="nil"/>
-              <w:left w:val="nil"/>
-              <w:bottom w:val="single" w:sz="4" w:space="0" w:color="auto"/>
-              <w:right w:val="nil"/>
-            </w:tcBorders>
-          </w:tcPr>
-          <w:p>
-            <w:pPr>
-              <w:jc w:val="center"/>
-              <w:rPr>
-                <w:b/>
-                <w:bCs/>
-              </w:rPr>
-            </w:pPr>
-            <w:r>
-              <w:rPr>
-                <w:b/>
-                <w:bCs/>
-              </w:rPr>
-              <w:t>Weekly / Regularly</w:t>
-            </w:r>
-          </w:p>
-        </w:tc>
-        <w:tc>
-          <w:tcPr>
-            <w:tcW w:w="2448" w:type="dxa"/>
-            <w:tcBorders>
-              <w:top w:val="nil"/>
-              <w:left w:val="nil"/>
-              <w:bottom w:val="single" w:sz="4" w:space="0" w:color="auto"/>
-              <w:right w:val="nil"/>
-            </w:tcBorders>
-          </w:tcPr>
-          <w:p>
-            <w:pPr>
-              <w:jc w:val="center"/>
-              <w:rPr>
-                <w:b/>
-                <w:bCs/>
-              </w:rPr>
-            </w:pPr>
-            <w:r>
-              <w:rPr>
-                <w:b/>
-                <w:bCs/>
-              </w:rPr>
-              <w:t>Monthly</w:t>
-            </w:r>
-          </w:p>
-        </w:tc>
-        <w:tc>
-          <w:tcPr>
-            <w:tcW w:w="2448" w:type="dxa"/>
-            <w:tcBorders>
-              <w:top w:val="nil"/>
-              <w:left w:val="nil"/>
-              <w:bottom w:val="single" w:sz="4" w:space="0" w:color="auto"/>
-              <w:right w:val="nil"/>
-            </w:tcBorders>
-          </w:tcPr>
-          <w:p>
-            <w:pPr>
-              <w:jc w:val="center"/>
-              <w:rPr>
-                <w:b/>
-                <w:bCs/>
-              </w:rPr>
-            </w:pPr>
-            <w:r>
-              <w:rPr>
-                <w:b/>
-                <w:bCs/>
-              </w:rPr>
-              <w:t>Seasonally</w:t>
-            </w:r>
-          </w:p>
-        </w:tc>
-        <w:tc>
-          <w:tcPr>
-            <w:tcW w:w="2448" w:type="dxa"/>
-            <w:tcBorders>
-              <w:top w:val="nil"/>
-              <w:left w:val="nil"/>
-              <w:bottom w:val="single" w:sz="4" w:space="0" w:color="auto"/>
-              <w:right w:val="nil"/>
-            </w:tcBorders>
-          </w:tcPr>
-          <w:p>
-            <w:pPr>
-              <w:jc w:val="center"/>
-              <w:rPr>
-                <w:b/>
-                <w:bCs/>
-              </w:rPr>
-            </w:pPr>
-            <w:r>
-              <w:rPr>
-                <w:b/>
-                <w:bCs/>
-              </w:rPr>
-              <w:t>Annually</w:t>
-            </w:r>
-          </w:p>
-        </w:tc>
-      </w:tr>
-      <w:tr>
-        <w:trPr>
-          <w:trHeight w:hRule="exact" w:val="2160"/>
-        </w:trPr>
-        <w:tc>
-          <w:tcPr>
-            <w:tcW w:w="2158" w:type="dxa"/>
-            <w:tcBorders>
-              <w:top w:val="nil"/>
-              <w:left w:val="nil"/>
-              <w:bottom w:val="nil"/>
-              <w:right w:val="single" w:sz="4" w:space="0" w:color="auto"/>
-            </w:tcBorders>
-            <w:vAlign w:val="center"/>
-          </w:tcPr>
-          <w:p>
-            <w:pPr>
-              <w:rPr>
-                <w:b/>
-                <w:bCs/>
-              </w:rPr>
-            </w:pPr>
-            <w:r>
-              <w:rPr>
-                <w:b/>
-                <w:bCs/>
-              </w:rPr>
-              <w:t>Foundations</w:t>
-            </w:r>
-          </w:p>
-        </w:tc>
-        <w:tc>
-          <w:tcPr>
-            <w:tcW w:w="2448" w:type="dxa"/>
-            <w:tcBorders>
-              <w:top w:val="single" w:sz="4" w:space="0" w:color="auto"/>
-              <w:left w:val="single" w:sz="4" w:space="0" w:color="auto"/>
-            </w:tcBorders>
-          </w:tcPr>
-          <w:p/>
-        </w:tc>
-        <w:tc>
-          <w:tcPr>
-            <w:tcW w:w="2448" w:type="dxa"/>
-            <w:tcBorders>
-              <w:top w:val="single" w:sz="4" w:space="0" w:color="auto"/>
-            </w:tcBorders>
-          </w:tcPr>
-          <w:p/>
-        </w:tc>
-        <w:tc>
-          <w:tcPr>
-            <w:tcW w:w="2448" w:type="dxa"/>
-            <w:tcBorders>
-              <w:top w:val="single" w:sz="4" w:space="0" w:color="auto"/>
-            </w:tcBorders>
-          </w:tcPr>
-          <w:p/>
-        </w:tc>
-        <w:tc>
-          <w:tcPr>
-            <w:tcW w:w="2448" w:type="dxa"/>
-            <w:tcBorders>
-              <w:top w:val="single" w:sz="4" w:space="0" w:color="auto"/>
-            </w:tcBorders>
-          </w:tcPr>
-          <w:p/>
-        </w:tc>
-        <w:tc>
-          <w:tcPr>
-            <w:tcW w:w="2448" w:type="dxa"/>
-            <w:tcBorders>
-              <w:top w:val="single" w:sz="4" w:space="0" w:color="auto"/>
-            </w:tcBorders>
-          </w:tcPr>
-          <w:p/>
-        </w:tc>
-      </w:tr>
-      <w:tr>
-        <w:trPr>
-          <w:trHeight w:hRule="exact" w:val="2160"/>
-        </w:trPr>
-        <w:tc>
-          <w:tcPr>
-            <w:tcW w:w="2158" w:type="dxa"/>
-            <w:tcBorders>
-              <w:top w:val="nil"/>
-              <w:left w:val="nil"/>
-              <w:bottom w:val="nil"/>
-              <w:right w:val="single" w:sz="4" w:space="0" w:color="auto"/>
-            </w:tcBorders>
-            <w:vAlign w:val="center"/>
-          </w:tcPr>
-          <w:p>
-            <w:pPr>
-              <w:rPr>
-                <w:b/>
-                <w:bCs/>
-              </w:rPr>
-            </w:pPr>
-            <w:r>
-              <w:rPr>
-                <w:b/>
-                <w:bCs/>
-              </w:rPr>
-              <w:t>Prayer</w:t>
-            </w:r>
-          </w:p>
-        </w:tc>
-        <w:tc>
-          <w:tcPr>
-            <w:tcW w:w="2448" w:type="dxa"/>
-            <w:tcBorders>
-              <w:left w:val="single" w:sz="4" w:space="0" w:color="auto"/>
-            </w:tcBorders>
-          </w:tcPr>
-          <w:p/>
-        </w:tc>
-        <w:tc>
-          <w:tcPr>
-            <w:tcW w:w="2448" w:type="dxa"/>
-          </w:tcPr>
-          <w:p/>
-        </w:tc>
-        <w:tc>
-          <w:tcPr>
-            <w:tcW w:w="2448" w:type="dxa"/>
-          </w:tcPr>
-          <w:p/>
-        </w:tc>
-        <w:tc>
-          <w:tcPr>
-            <w:tcW w:w="2448" w:type="dxa"/>
-          </w:tcPr>
-          <w:p/>
-        </w:tc>
-        <w:tc>
-          <w:tcPr>
-            <w:tcW w:w="2448" w:type="dxa"/>
-          </w:tcPr>
-          <w:p/>
-        </w:tc>
-      </w:tr>
-      <w:tr>
-        <w:trPr>
-          <w:trHeight w:hRule="exact" w:val="2160"/>
-        </w:trPr>
-        <w:tc>
-          <w:tcPr>
-            <w:tcW w:w="2158" w:type="dxa"/>
-            <w:tcBorders>
-              <w:top w:val="nil"/>
-              <w:left w:val="nil"/>
-              <w:bottom w:val="nil"/>
-              <w:right w:val="single" w:sz="4" w:space="0" w:color="auto"/>
-            </w:tcBorders>
-            <w:vAlign w:val="center"/>
-          </w:tcPr>
-          <w:p>
-            <w:pPr>
-              <w:rPr>
-                <w:b/>
-                <w:bCs/>
-              </w:rPr>
-            </w:pPr>
-            <w:r>
-              <w:rPr>
-                <w:b/>
-                <w:bCs/>
-              </w:rPr>
-              <w:t>Rhythms of Formation</w:t>
-            </w:r>
-          </w:p>
-        </w:tc>
-        <w:tc>
-          <w:tcPr>
-            <w:tcW w:w="2448" w:type="dxa"/>
-            <w:tcBorders>
-              <w:left w:val="single" w:sz="4" w:space="0" w:color="auto"/>
-            </w:tcBorders>
-          </w:tcPr>
-          <w:p/>
-        </w:tc>
-        <w:tc>
-          <w:tcPr>
-            <w:tcW w:w="2448" w:type="dxa"/>
-          </w:tcPr>
-          <w:p/>
-        </w:tc>
-        <w:tc>
-          <w:tcPr>
-            <w:tcW w:w="2448" w:type="dxa"/>
-          </w:tcPr>
-          <w:p/>
-        </w:tc>
-        <w:tc>
-          <w:tcPr>
-            <w:tcW w:w="2448" w:type="dxa"/>
-          </w:tcPr>
-          <w:p/>
-        </w:tc>
-        <w:tc>
-          <w:tcPr>
-            <w:tcW w:w="2448" w:type="dxa"/>
-          </w:tcPr>
-          <w:p/>
-        </w:tc>
-      </w:tr>
-      <w:tr>
-        <w:trPr>
-          <w:trHeight w:hRule="exact" w:val="2160"/>
-        </w:trPr>
-        <w:tc>
-          <w:tcPr>
-            <w:tcW w:w="2158" w:type="dxa"/>
-            <w:tcBorders>
-              <w:top w:val="nil"/>
-              <w:left w:val="nil"/>
-              <w:bottom w:val="nil"/>
-              <w:right w:val="single" w:sz="4" w:space="0" w:color="auto"/>
-            </w:tcBorders>
-            <w:vAlign w:val="center"/>
-          </w:tcPr>
-          <w:p>
-            <w:pPr>
-              <w:rPr>
-                <w:b/>
-                <w:bCs/>
-                <w:i/>
-                <w:iCs/>
-              </w:rPr>
-            </w:pPr>
-            <w:proofErr w:type="spellStart"/>
-            <w:r>
-              <w:rPr>
-                <w:b/>
-                <w:bCs/>
-                <w:i/>
-                <w:iCs/>
-              </w:rPr>
-              <w:t>Missio</w:t>
-            </w:r>
-            <w:proofErr w:type="spellEnd"/>
-            <w:r>
-              <w:rPr>
-                <w:b/>
-                <w:bCs/>
-                <w:i/>
-                <w:iCs/>
-              </w:rPr>
-              <w:t xml:space="preserve"> Dei</w:t>
-            </w:r>
-          </w:p>
-        </w:tc>
-        <w:tc>
-          <w:tcPr>
-            <w:tcW w:w="2448" w:type="dxa"/>
-            <w:tcBorders>
-              <w:left w:val="single" w:sz="4" w:space="0" w:color="auto"/>
-            </w:tcBorders>
-          </w:tcPr>
-          <w:p/>
-        </w:tc>
-        <w:tc>
-          <w:tcPr>
-            <w:tcW w:w="2448" w:type="dxa"/>
-          </w:tcPr>
-          <w:p/>
-        </w:tc>
-        <w:tc>
-          <w:tcPr>
-            <w:tcW w:w="2448" w:type="dxa"/>
-          </w:tcPr>
-          <w:p/>
-        </w:tc>
-        <w:tc>
-          <w:tcPr>
-            <w:tcW w:w="2448" w:type="dxa"/>
-          </w:tcPr>
-          <w:p/>
-        </w:tc>
-        <w:tc>
-          <w:tcPr>
-            <w:tcW w:w="2448" w:type="dxa"/>
+            <w:tcW w:w="2044" w:type="dxa"/>
+            <w:tcBorders>
+              <w:top w:val="single" w:sz="1" w:space="0" w:color="C8D8E8"/>
+              <w:left w:val="single" w:sz="1" w:space="0" w:color="C8D8E8"/>
+              <w:bottom w:val="single" w:sz="1" w:space="0" w:color="C8D8E8"/>
+              <w:right w:val="single" w:sz="1" w:space="0" w:color="C8D8E8"/>
+            </w:tcBorders>
+            <w:shd w:val="clear" w:color="auto" w:fill="FFFFFF"/>
+            <w:tcMar>
+              <w:top w:w="80" w:type="dxa"/>
+              <w:left w:w="120" w:type="dxa"/>
+              <w:bottom w:w="80" w:type="dxa"/>
+              <w:right w:w="120" w:type="dxa"/>
+            </w:tcMar>
+          </w:tcPr>
+          <w:p/>
+          <w:p/>
+          <w:p/>
+          <w:p/>
+          <w:p/>
+          <w:p/>
+          <w:p/>
+          <w:p/>
+          <w:p/>
+          <w:p/>
+          <w:p/>
+          <w:p/>
+          <w:p/>
+        </w:tc>
+        <w:tc>
+          <w:tcPr>
+            <w:tcW w:w="2036" w:type="dxa"/>
+            <w:tcBorders>
+              <w:top w:val="single" w:sz="1" w:space="0" w:color="C8D8E8"/>
+              <w:left w:val="single" w:sz="1" w:space="0" w:color="C8D8E8"/>
+              <w:bottom w:val="single" w:sz="1" w:space="0" w:color="C8D8E8"/>
+              <w:right w:val="single" w:sz="1" w:space="0" w:color="C8D8E8"/>
+            </w:tcBorders>
+            <w:shd w:val="clear" w:color="auto" w:fill="FFFFFF"/>
+            <w:tcMar>
+              <w:top w:w="80" w:type="dxa"/>
+              <w:left w:w="120" w:type="dxa"/>
+              <w:bottom w:w="80" w:type="dxa"/>
+              <w:right w:w="120" w:type="dxa"/>
+            </w:tcMar>
+          </w:tcPr>
+          <w:p/>
+        </w:tc>
+        <w:tc>
+          <w:tcPr>
+            <w:tcW w:w="1758" w:type="dxa"/>
+            <w:tcBorders>
+              <w:top w:val="single" w:sz="1" w:space="0" w:color="C8D8E8"/>
+              <w:left w:val="single" w:sz="1" w:space="0" w:color="C8D8E8"/>
+              <w:bottom w:val="single" w:sz="1" w:space="0" w:color="C8D8E8"/>
+              <w:right w:val="single" w:sz="1" w:space="0" w:color="C8D8E8"/>
+            </w:tcBorders>
+            <w:shd w:val="clear" w:color="auto" w:fill="FFFFFF"/>
+            <w:tcMar>
+              <w:top w:w="80" w:type="dxa"/>
+              <w:left w:w="120" w:type="dxa"/>
+              <w:bottom w:w="80" w:type="dxa"/>
+              <w:right w:w="120" w:type="dxa"/>
+            </w:tcMar>
+          </w:tcPr>
+          <w:p/>
+        </w:tc>
+        <w:tc>
+          <w:tcPr>
+            <w:tcW w:w="1630" w:type="dxa"/>
+            <w:tcBorders>
+              <w:top w:val="single" w:sz="1" w:space="0" w:color="C8D8E8"/>
+              <w:left w:val="single" w:sz="1" w:space="0" w:color="C8D8E8"/>
+              <w:bottom w:val="single" w:sz="1" w:space="0" w:color="C8D8E8"/>
+              <w:right w:val="single" w:sz="1" w:space="0" w:color="C8D8E8"/>
+            </w:tcBorders>
+            <w:shd w:val="clear" w:color="auto" w:fill="FFFFFF"/>
+            <w:tcMar>
+              <w:top w:w="80" w:type="dxa"/>
+              <w:left w:w="120" w:type="dxa"/>
+              <w:bottom w:w="80" w:type="dxa"/>
+              <w:right w:w="120" w:type="dxa"/>
+            </w:tcMar>
+          </w:tcPr>
+          <w:p/>
+        </w:tc>
+        <w:tc>
+          <w:tcPr>
+            <w:tcW w:w="1629" w:type="dxa"/>
+            <w:tcBorders>
+              <w:top w:val="single" w:sz="1" w:space="0" w:color="C8D8E8"/>
+              <w:left w:val="single" w:sz="1" w:space="0" w:color="C8D8E8"/>
+              <w:bottom w:val="single" w:sz="1" w:space="0" w:color="C8D8E8"/>
+              <w:right w:val="single" w:sz="1" w:space="0" w:color="C8D8E8"/>
+            </w:tcBorders>
+            <w:shd w:val="clear" w:color="auto" w:fill="FFFFFF"/>
+            <w:tcMar>
+              <w:top w:w="80" w:type="dxa"/>
+              <w:left w:w="120" w:type="dxa"/>
+              <w:bottom w:w="80" w:type="dxa"/>
+              <w:right w:w="120" w:type="dxa"/>
+            </w:tcMar>
           </w:tcPr>
           <w:p/>
         </w:tc>
@@ -465,13 +910,134 @@
     </w:tbl>
     <w:p/>
     <w:sectPr>
-      <w:pgSz w:w="15840" w:h="12240" w:orient="landscape"/>
-      <w:pgMar w:top="720" w:right="720" w:bottom="720" w:left="720" w:header="720" w:footer="720" w:gutter="0"/>
+      <w:pgSz w:w="12240" w:h="15840" w:code="1"/>
+      <w:pgMar w:top="720" w:right="864" w:bottom="720" w:left="864" w:header="708" w:footer="708" w:gutter="0"/>
       <w:cols w:space="720"/>
       <w:docGrid w:linePitch="360"/>
     </w:sectPr>
   </w:body>
 </w:document>
+</file>
+
+<file path=word/numbering.xml><?xml version="1.0" encoding="utf-8"?>
+<w:numbering xmlns:wpc="http://schemas.microsoft.com/office/word/2010/wordprocessingCanvas" xmlns:cx="http://schemas.microsoft.com/office/drawing/2014/chartex" xmlns:cx1="http://schemas.microsoft.com/office/drawing/2015/9/8/chartex" xmlns:cx2="http://schemas.microsoft.com/office/drawing/2015/10/21/chartex" xmlns:cx3="http://schemas.microsoft.com/office/drawing/2016/5/9/chartex" xmlns:cx4="http://schemas.microsoft.com/office/drawing/2016/5/10/chartex" xmlns:cx5="http://schemas.microsoft.com/office/drawing/2016/5/11/chartex" xmlns:cx6="http://schemas.microsoft.com/office/drawing/2016/5/12/chartex" xmlns:cx7="http://schemas.microsoft.com/office/drawing/2016/5/13/chartex" xmlns:cx8="http://schemas.microsoft.com/office/drawing/2016/5/14/chartex" xmlns:mc="http://schemas.openxmlformats.org/markup-compatibility/2006" xmlns:aink="http://schemas.microsoft.com/office/drawing/2016/ink" xmlns:am3d="http://schemas.microsoft.com/office/drawing/2017/model3d" xmlns:o="urn:schemas-microsoft-com:office:office" xmlns:oel="http://schemas.microsoft.com/office/2019/extlst" xmlns:r="http://schemas.openxmlformats.org/officeDocument/2006/relationships" xmlns:m="http://schemas.openxmlformats.org/officeDocument/2006/math" xmlns:v="urn:schemas-microsoft-com:vml" xmlns:wp14="http://schemas.microsoft.com/office/word/2010/wordprocessingDrawing" xmlns:wp="http://schemas.openxmlformats.org/drawingml/2006/wordprocessingDrawing" xmlns:w10="urn:schemas-microsoft-com:office:word" xmlns:w="http://schemas.openxmlformats.org/wordprocessingml/2006/main" xmlns:w14="http://schemas.microsoft.com/office/word/2010/wordml" xmlns:w15="http://schemas.microsoft.com/office/word/2012/wordml" xmlns:w16cex="http://schemas.microsoft.com/office/word/2018/wordml/cex" xmlns:w16cid="http://schemas.microsoft.com/office/word/2016/wordml/cid" xmlns:w16="http://schemas.microsoft.com/office/word/2018/wordml" xmlns:w16du="http://schemas.microsoft.com/office/word/2023/wordml/word16du" xmlns:w16sdtdh="http://schemas.microsoft.com/office/word/2020/wordml/sdtdatahash" xmlns:w16sdtfl="http://schemas.microsoft.com/office/word/2024/wordml/sdtformatlock" xmlns:w16se="http://schemas.microsoft.com/office/word/2015/wordml/symex" xmlns:wpg="http://schemas.microsoft.com/office/word/2010/wordprocessingGroup" xmlns:wpi="http://schemas.microsoft.com/office/word/2010/wordprocessingInk" xmlns:wne="http://schemas.microsoft.com/office/word/2006/wordml" xmlns:wps="http://schemas.microsoft.com/office/word/2010/wordprocessingShape" mc:Ignorable="w14 w15 w16se w16cid w16 w16cex w16sdtdh w16sdtfl w16du wp14">
+  <w:abstractNum w:abstractNumId="0" w15:restartNumberingAfterBreak="0">
+    <w:nsid w:val="277C05F7"/>
+    <w:multiLevelType w:val="hybridMultilevel"/>
+    <w:tmpl w:val="E55C7652"/>
+    <w:lvl w:ilvl="0" w:tplc="04090001">
+      <w:start w:val="1"/>
+      <w:numFmt w:val="bullet"/>
+      <w:lvlText w:val=""/>
+      <w:lvlJc w:val="left"/>
+      <w:pPr>
+        <w:ind w:left="720" w:hanging="360"/>
+      </w:pPr>
+      <w:rPr>
+        <w:rFonts w:ascii="Symbol" w:hAnsi="Symbol" w:hint="default"/>
+      </w:rPr>
+    </w:lvl>
+    <w:lvl w:ilvl="1" w:tplc="04090003" w:tentative="1">
+      <w:start w:val="1"/>
+      <w:numFmt w:val="bullet"/>
+      <w:lvlText w:val="o"/>
+      <w:lvlJc w:val="left"/>
+      <w:pPr>
+        <w:ind w:left="1440" w:hanging="360"/>
+      </w:pPr>
+      <w:rPr>
+        <w:rFonts w:ascii="Courier New" w:hAnsi="Courier New" w:cs="Courier New" w:hint="default"/>
+      </w:rPr>
+    </w:lvl>
+    <w:lvl w:ilvl="2" w:tplc="04090005" w:tentative="1">
+      <w:start w:val="1"/>
+      <w:numFmt w:val="bullet"/>
+      <w:lvlText w:val=""/>
+      <w:lvlJc w:val="left"/>
+      <w:pPr>
+        <w:ind w:left="2160" w:hanging="360"/>
+      </w:pPr>
+      <w:rPr>
+        <w:rFonts w:ascii="Wingdings" w:hAnsi="Wingdings" w:hint="default"/>
+      </w:rPr>
+    </w:lvl>
+    <w:lvl w:ilvl="3" w:tplc="04090001" w:tentative="1">
+      <w:start w:val="1"/>
+      <w:numFmt w:val="bullet"/>
+      <w:lvlText w:val=""/>
+      <w:lvlJc w:val="left"/>
+      <w:pPr>
+        <w:ind w:left="2880" w:hanging="360"/>
+      </w:pPr>
+      <w:rPr>
+        <w:rFonts w:ascii="Symbol" w:hAnsi="Symbol" w:hint="default"/>
+      </w:rPr>
+    </w:lvl>
+    <w:lvl w:ilvl="4" w:tplc="04090003" w:tentative="1">
+      <w:start w:val="1"/>
+      <w:numFmt w:val="bullet"/>
+      <w:lvlText w:val="o"/>
+      <w:lvlJc w:val="left"/>
+      <w:pPr>
+        <w:ind w:left="3600" w:hanging="360"/>
+      </w:pPr>
+      <w:rPr>
+        <w:rFonts w:ascii="Courier New" w:hAnsi="Courier New" w:cs="Courier New" w:hint="default"/>
+      </w:rPr>
+    </w:lvl>
+    <w:lvl w:ilvl="5" w:tplc="04090005" w:tentative="1">
+      <w:start w:val="1"/>
+      <w:numFmt w:val="bullet"/>
+      <w:lvlText w:val=""/>
+      <w:lvlJc w:val="left"/>
+      <w:pPr>
+        <w:ind w:left="4320" w:hanging="360"/>
+      </w:pPr>
+      <w:rPr>
+        <w:rFonts w:ascii="Wingdings" w:hAnsi="Wingdings" w:hint="default"/>
+      </w:rPr>
+    </w:lvl>
+    <w:lvl w:ilvl="6" w:tplc="04090001" w:tentative="1">
+      <w:start w:val="1"/>
+      <w:numFmt w:val="bullet"/>
+      <w:lvlText w:val=""/>
+      <w:lvlJc w:val="left"/>
+      <w:pPr>
+        <w:ind w:left="5040" w:hanging="360"/>
+      </w:pPr>
+      <w:rPr>
+        <w:rFonts w:ascii="Symbol" w:hAnsi="Symbol" w:hint="default"/>
+      </w:rPr>
+    </w:lvl>
+    <w:lvl w:ilvl="7" w:tplc="04090003" w:tentative="1">
+      <w:start w:val="1"/>
+      <w:numFmt w:val="bullet"/>
+      <w:lvlText w:val="o"/>
+      <w:lvlJc w:val="left"/>
+      <w:pPr>
+        <w:ind w:left="5760" w:hanging="360"/>
+      </w:pPr>
+      <w:rPr>
+        <w:rFonts w:ascii="Courier New" w:hAnsi="Courier New" w:cs="Courier New" w:hint="default"/>
+      </w:rPr>
+    </w:lvl>
+    <w:lvl w:ilvl="8" w:tplc="04090005" w:tentative="1">
+      <w:start w:val="1"/>
+      <w:numFmt w:val="bullet"/>
+      <w:lvlText w:val=""/>
+      <w:lvlJc w:val="left"/>
+      <w:pPr>
+        <w:ind w:left="6480" w:hanging="360"/>
+      </w:pPr>
+      <w:rPr>
+        <w:rFonts w:ascii="Wingdings" w:hAnsi="Wingdings" w:hint="default"/>
+      </w:rPr>
+    </w:lvl>
+  </w:abstractNum>
+  <w:num w:numId="1" w16cid:durableId="315111505">
+    <w:abstractNumId w:val="0"/>
+  </w:num>
+</w:numbering>
 </file>
 
 <file path=word/styles.xml><?xml version="1.0" encoding="utf-8"?>
@@ -673,7 +1239,7 @@
     <w:lsdException w:name="Medium Shading 2 Accent 1" w:uiPriority="64"/>
     <w:lsdException w:name="Medium List 1 Accent 1" w:uiPriority="65"/>
     <w:lsdException w:name="Revision" w:semiHidden="1"/>
-    <w:lsdException w:name="List Paragraph" w:uiPriority="34" w:qFormat="1"/>
+    <w:lsdException w:name="List Paragraph" w:uiPriority="0" w:qFormat="1"/>
     <w:lsdException w:name="Quote" w:uiPriority="29" w:qFormat="1"/>
     <w:lsdException w:name="Intense Quote" w:uiPriority="30" w:qFormat="1"/>
     <w:lsdException w:name="Medium List 2 Accent 1" w:uiPriority="66"/>
@@ -874,6 +1440,17 @@
   <w:style w:type="paragraph" w:default="1" w:styleId="Normal">
     <w:name w:val="Normal"/>
     <w:qFormat/>
+    <w:rsid w:val="00CB5C0D"/>
+    <w:pPr>
+      <w:spacing w:after="0" w:line="240" w:lineRule="auto"/>
+    </w:pPr>
+    <w:rPr>
+      <w:rFonts w:ascii="Arial" w:eastAsia="Arial" w:hAnsi="Arial" w:cs="Arial"/>
+      <w:kern w:val="0"/>
+      <w:sz w:val="20"/>
+      <w:szCs w:val="20"/>
+      <w14:ligatures w14:val="none"/>
+    </w:rPr>
   </w:style>
   <w:style w:type="paragraph" w:styleId="Heading1">
     <w:name w:val="heading 1"/>
@@ -882,7 +1459,7 @@
     <w:link w:val="Heading1Char"/>
     <w:uiPriority w:val="9"/>
     <w:qFormat/>
-    <w:rsid w:val="00017B75"/>
+    <w:rsid w:val="00F20349"/>
     <w:pPr>
       <w:keepNext/>
       <w:keepLines/>
@@ -905,7 +1482,7 @@
     <w:semiHidden/>
     <w:unhideWhenUsed/>
     <w:qFormat/>
-    <w:rsid w:val="00017B75"/>
+    <w:rsid w:val="00F20349"/>
     <w:pPr>
       <w:keepNext/>
       <w:keepLines/>
@@ -928,7 +1505,7 @@
     <w:semiHidden/>
     <w:unhideWhenUsed/>
     <w:qFormat/>
-    <w:rsid w:val="00017B75"/>
+    <w:rsid w:val="00F20349"/>
     <w:pPr>
       <w:keepNext/>
       <w:keepLines/>
@@ -951,7 +1528,7 @@
     <w:semiHidden/>
     <w:unhideWhenUsed/>
     <w:qFormat/>
-    <w:rsid w:val="00017B75"/>
+    <w:rsid w:val="00F20349"/>
     <w:pPr>
       <w:keepNext/>
       <w:keepLines/>
@@ -974,7 +1551,7 @@
     <w:semiHidden/>
     <w:unhideWhenUsed/>
     <w:qFormat/>
-    <w:rsid w:val="00017B75"/>
+    <w:rsid w:val="00F20349"/>
     <w:pPr>
       <w:keepNext/>
       <w:keepLines/>
@@ -995,11 +1572,11 @@
     <w:semiHidden/>
     <w:unhideWhenUsed/>
     <w:qFormat/>
-    <w:rsid w:val="00017B75"/>
+    <w:rsid w:val="00F20349"/>
     <w:pPr>
       <w:keepNext/>
       <w:keepLines/>
-      <w:spacing w:before="40" w:after="0"/>
+      <w:spacing w:before="40"/>
       <w:outlineLvl w:val="5"/>
     </w:pPr>
     <w:rPr>
@@ -1018,11 +1595,11 @@
     <w:semiHidden/>
     <w:unhideWhenUsed/>
     <w:qFormat/>
-    <w:rsid w:val="00017B75"/>
+    <w:rsid w:val="00F20349"/>
     <w:pPr>
       <w:keepNext/>
       <w:keepLines/>
-      <w:spacing w:before="40" w:after="0"/>
+      <w:spacing w:before="40"/>
       <w:outlineLvl w:val="6"/>
     </w:pPr>
     <w:rPr>
@@ -1039,11 +1616,10 @@
     <w:semiHidden/>
     <w:unhideWhenUsed/>
     <w:qFormat/>
-    <w:rsid w:val="00017B75"/>
+    <w:rsid w:val="00F20349"/>
     <w:pPr>
       <w:keepNext/>
       <w:keepLines/>
-      <w:spacing w:after="0"/>
       <w:outlineLvl w:val="7"/>
     </w:pPr>
     <w:rPr>
@@ -1062,11 +1638,10 @@
     <w:semiHidden/>
     <w:unhideWhenUsed/>
     <w:qFormat/>
-    <w:rsid w:val="00017B75"/>
+    <w:rsid w:val="00F20349"/>
     <w:pPr>
       <w:keepNext/>
       <w:keepLines/>
-      <w:spacing w:after="0"/>
       <w:outlineLvl w:val="8"/>
     </w:pPr>
     <w:rPr>
@@ -1106,7 +1681,7 @@
     <w:basedOn w:val="DefaultParagraphFont"/>
     <w:link w:val="Heading1"/>
     <w:uiPriority w:val="9"/>
-    <w:rsid w:val="00017B75"/>
+    <w:rsid w:val="00F20349"/>
     <w:rPr>
       <w:rFonts w:asciiTheme="majorHAnsi" w:eastAsiaTheme="majorEastAsia" w:hAnsiTheme="majorHAnsi" w:cstheme="majorBidi"/>
       <w:color w:val="0F4761" w:themeColor="accent1" w:themeShade="BF"/>
@@ -1120,7 +1695,7 @@
     <w:link w:val="Heading2"/>
     <w:uiPriority w:val="9"/>
     <w:semiHidden/>
-    <w:rsid w:val="00017B75"/>
+    <w:rsid w:val="00F20349"/>
     <w:rPr>
       <w:rFonts w:asciiTheme="majorHAnsi" w:eastAsiaTheme="majorEastAsia" w:hAnsiTheme="majorHAnsi" w:cstheme="majorBidi"/>
       <w:color w:val="0F4761" w:themeColor="accent1" w:themeShade="BF"/>
@@ -1134,7 +1709,7 @@
     <w:link w:val="Heading3"/>
     <w:uiPriority w:val="9"/>
     <w:semiHidden/>
-    <w:rsid w:val="00017B75"/>
+    <w:rsid w:val="00F20349"/>
     <w:rPr>
       <w:rFonts w:eastAsiaTheme="majorEastAsia" w:cstheme="majorBidi"/>
       <w:color w:val="0F4761" w:themeColor="accent1" w:themeShade="BF"/>
@@ -1148,7 +1723,7 @@
     <w:link w:val="Heading4"/>
     <w:uiPriority w:val="9"/>
     <w:semiHidden/>
-    <w:rsid w:val="00017B75"/>
+    <w:rsid w:val="00F20349"/>
     <w:rPr>
       <w:rFonts w:eastAsiaTheme="majorEastAsia" w:cstheme="majorBidi"/>
       <w:i/>
@@ -1162,7 +1737,7 @@
     <w:link w:val="Heading5"/>
     <w:uiPriority w:val="9"/>
     <w:semiHidden/>
-    <w:rsid w:val="00017B75"/>
+    <w:rsid w:val="00F20349"/>
     <w:rPr>
       <w:rFonts w:eastAsiaTheme="majorEastAsia" w:cstheme="majorBidi"/>
       <w:color w:val="0F4761" w:themeColor="accent1" w:themeShade="BF"/>
@@ -1174,7 +1749,7 @@
     <w:link w:val="Heading6"/>
     <w:uiPriority w:val="9"/>
     <w:semiHidden/>
-    <w:rsid w:val="00017B75"/>
+    <w:rsid w:val="00F20349"/>
     <w:rPr>
       <w:rFonts w:eastAsiaTheme="majorEastAsia" w:cstheme="majorBidi"/>
       <w:i/>
@@ -1188,7 +1763,7 @@
     <w:link w:val="Heading7"/>
     <w:uiPriority w:val="9"/>
     <w:semiHidden/>
-    <w:rsid w:val="00017B75"/>
+    <w:rsid w:val="00F20349"/>
     <w:rPr>
       <w:rFonts w:eastAsiaTheme="majorEastAsia" w:cstheme="majorBidi"/>
       <w:color w:val="595959" w:themeColor="text1" w:themeTint="A6"/>
@@ -1200,7 +1775,7 @@
     <w:link w:val="Heading8"/>
     <w:uiPriority w:val="9"/>
     <w:semiHidden/>
-    <w:rsid w:val="00017B75"/>
+    <w:rsid w:val="00F20349"/>
     <w:rPr>
       <w:rFonts w:eastAsiaTheme="majorEastAsia" w:cstheme="majorBidi"/>
       <w:i/>
@@ -1214,7 +1789,7 @@
     <w:link w:val="Heading9"/>
     <w:uiPriority w:val="9"/>
     <w:semiHidden/>
-    <w:rsid w:val="00017B75"/>
+    <w:rsid w:val="00F20349"/>
     <w:rPr>
       <w:rFonts w:eastAsiaTheme="majorEastAsia" w:cstheme="majorBidi"/>
       <w:color w:val="272727" w:themeColor="text1" w:themeTint="D8"/>
@@ -1227,9 +1802,9 @@
     <w:link w:val="TitleChar"/>
     <w:uiPriority w:val="10"/>
     <w:qFormat/>
-    <w:rsid w:val="00017B75"/>
+    <w:rsid w:val="00F20349"/>
     <w:pPr>
-      <w:spacing w:after="80" w:line="240" w:lineRule="auto"/>
+      <w:spacing w:after="80"/>
       <w:contextualSpacing/>
     </w:pPr>
     <w:rPr>
@@ -1245,7 +1820,7 @@
     <w:basedOn w:val="DefaultParagraphFont"/>
     <w:link w:val="Title"/>
     <w:uiPriority w:val="10"/>
-    <w:rsid w:val="00017B75"/>
+    <w:rsid w:val="00F20349"/>
     <w:rPr>
       <w:rFonts w:asciiTheme="majorHAnsi" w:eastAsiaTheme="majorEastAsia" w:hAnsiTheme="majorHAnsi" w:cstheme="majorBidi"/>
       <w:spacing w:val="-10"/>
@@ -1261,7 +1836,7 @@
     <w:link w:val="SubtitleChar"/>
     <w:uiPriority w:val="11"/>
     <w:qFormat/>
-    <w:rsid w:val="00017B75"/>
+    <w:rsid w:val="00F20349"/>
     <w:pPr>
       <w:numPr>
         <w:ilvl w:val="1"/>
@@ -1280,7 +1855,7 @@
     <w:basedOn w:val="DefaultParagraphFont"/>
     <w:link w:val="Subtitle"/>
     <w:uiPriority w:val="11"/>
-    <w:rsid w:val="00017B75"/>
+    <w:rsid w:val="00F20349"/>
     <w:rPr>
       <w:rFonts w:eastAsiaTheme="majorEastAsia" w:cstheme="majorBidi"/>
       <w:color w:val="595959" w:themeColor="text1" w:themeTint="A6"/>
@@ -1296,7 +1871,7 @@
     <w:link w:val="QuoteChar"/>
     <w:uiPriority w:val="29"/>
     <w:qFormat/>
-    <w:rsid w:val="00017B75"/>
+    <w:rsid w:val="00F20349"/>
     <w:pPr>
       <w:spacing w:before="160"/>
       <w:jc w:val="center"/>
@@ -1312,7 +1887,7 @@
     <w:basedOn w:val="DefaultParagraphFont"/>
     <w:link w:val="Quote"/>
     <w:uiPriority w:val="29"/>
-    <w:rsid w:val="00017B75"/>
+    <w:rsid w:val="00F20349"/>
     <w:rPr>
       <w:i/>
       <w:iCs/>
@@ -1322,9 +1897,8 @@
   <w:style w:type="paragraph" w:styleId="ListParagraph">
     <w:name w:val="List Paragraph"/>
     <w:basedOn w:val="Normal"/>
-    <w:uiPriority w:val="34"/>
     <w:qFormat/>
-    <w:rsid w:val="00017B75"/>
+    <w:rsid w:val="00F20349"/>
     <w:pPr>
       <w:ind w:left="720"/>
       <w:contextualSpacing/>
@@ -1335,7 +1909,7 @@
     <w:basedOn w:val="DefaultParagraphFont"/>
     <w:uiPriority w:val="21"/>
     <w:qFormat/>
-    <w:rsid w:val="00017B75"/>
+    <w:rsid w:val="00F20349"/>
     <w:rPr>
       <w:i/>
       <w:iCs/>
@@ -1349,7 +1923,7 @@
     <w:link w:val="IntenseQuoteChar"/>
     <w:uiPriority w:val="30"/>
     <w:qFormat/>
-    <w:rsid w:val="00017B75"/>
+    <w:rsid w:val="00F20349"/>
     <w:pPr>
       <w:pBdr>
         <w:top w:val="single" w:sz="4" w:space="10" w:color="0F4761" w:themeColor="accent1" w:themeShade="BF"/>
@@ -1370,7 +1944,7 @@
     <w:basedOn w:val="DefaultParagraphFont"/>
     <w:link w:val="IntenseQuote"/>
     <w:uiPriority w:val="30"/>
-    <w:rsid w:val="00017B75"/>
+    <w:rsid w:val="00F20349"/>
     <w:rPr>
       <w:i/>
       <w:iCs/>
@@ -1382,7 +1956,7 @@
     <w:basedOn w:val="DefaultParagraphFont"/>
     <w:uiPriority w:val="32"/>
     <w:qFormat/>
-    <w:rsid w:val="00017B75"/>
+    <w:rsid w:val="00F20349"/>
     <w:rPr>
       <w:b/>
       <w:bCs/>
@@ -1390,25 +1964,6 @@
       <w:color w:val="0F4761" w:themeColor="accent1" w:themeShade="BF"/>
       <w:spacing w:val="5"/>
     </w:rPr>
-  </w:style>
-  <w:style w:type="table" w:styleId="TableGrid">
-    <w:name w:val="Table Grid"/>
-    <w:basedOn w:val="TableNormal"/>
-    <w:uiPriority w:val="39"/>
-    <w:rsid w:val="00017B75"/>
-    <w:pPr>
-      <w:spacing w:after="0" w:line="240" w:lineRule="auto"/>
-    </w:pPr>
-    <w:tblPr>
-      <w:tblBorders>
-        <w:top w:val="single" w:sz="4" w:space="0" w:color="auto"/>
-        <w:left w:val="single" w:sz="4" w:space="0" w:color="auto"/>
-        <w:bottom w:val="single" w:sz="4" w:space="0" w:color="auto"/>
-        <w:right w:val="single" w:sz="4" w:space="0" w:color="auto"/>
-        <w:insideH w:val="single" w:sz="4" w:space="0" w:color="auto"/>
-        <w:insideV w:val="single" w:sz="4" w:space="0" w:color="auto"/>
-      </w:tblBorders>
-    </w:tblPr>
   </w:style>
 </w:styles>
 </file>

</xml_diff>